<commit_message>
docs: verify Uptime Kuma walkthrough and introduce AutoScribeAI for users
</commit_message>
<xml_diff>
--- a/tests/manual_samples/uptime-kuma/output/manual.docx
+++ b/tests/manual_samples/uptime-kuma/output/manual.docx
@@ -18,7 +18,7 @@
         <w:rPr>
           <w:b/>
         </w:rPr>
-        <w:t>Uptime Kuma · GitHub 源码快照 e7420f8fa546</w:t>
+        <w:t>Uptime Kuma · Uptime Kuma 官方演示实例 demo.kuma.pet（2026-09-29；临时环境）</w:t>
       </w:r>
     </w:p>
     <w:p>
@@ -60,7 +60,7 @@
         <w:t xml:space="preserve">流程状态: </w:t>
       </w:r>
       <w:r>
-        <w:t>已验证 0 · 受阻 0 · 未验证 3 · 待处理 0</w:t>
+        <w:t>已验证 3 · 受阻 0 · 未验证 0 · 待处理 0</w:t>
       </w:r>
     </w:p>
     <w:p>
@@ -83,7 +83,7 @@
     </w:p>
     <w:p>
       <w:r>
-        <w:t>本章介绍HTTP 监控的源码线索与候选操作步骤，供后续在目标实例中逐项验证。</w:t>
+        <w:t>监控项配置的实际界面流程与结果，按 Uptime Kuma 官方临时演示实例记录。</w:t>
       </w:r>
     </w:p>
     <w:p>
@@ -155,7 +155,7 @@
         <w:t xml:space="preserve">流程状态: </w:t>
       </w:r>
       <w:r>
-        <w:t>未验证</w:t>
+        <w:t>已验证</w:t>
       </w:r>
     </w:p>
     <w:p>
@@ -197,7 +197,7 @@
         <w:t xml:space="preserve">成功标准: </w:t>
       </w:r>
       <w:r>
-        <w:t>源码显示监控编辑页面包含监控类型与配置字段；成功标准是监控项保存后出现在监控列表中。</w:t>
+        <w:t>HTTP 监控保存后出现在仪表盘，显示正常状态和成功心跳。</w:t>
       </w:r>
     </w:p>
     <w:p>
@@ -214,17 +214,6 @@
       </w:pPr>
       <w:r>
         <w:t>已打开 Uptime Kuma 的 Web 界面并具有添加监控项的权限。</w:t>
-      </w:r>
-    </w:p>
-    <w:p>
-      <w:r>
-        <w:rPr>
-          <w:b/>
-        </w:rPr>
-        <w:t xml:space="preserve">说明: </w:t>
-      </w:r>
-      <w:r>
-        <w:t>本流程根据固定版本的公开源码整理，尚未在目标应用中实际操作或验证。</w:t>
       </w:r>
     </w:p>
     <w:p>
@@ -238,7 +227,7 @@
         <w:rPr>
           <w:b/>
         </w:rPr>
-        <w:t>打开监控项编辑入口并选择 HTTP 监控类型。</w:t>
+        <w:t>进入“添加监控项”，选择 HTTP(s) 类型。</w:t>
       </w:r>
     </w:p>
     <w:p>
@@ -266,7 +255,71 @@
         <w:t xml:space="preserve">预期: </w:t>
       </w:r>
       <w:r>
-        <w:t>源码线索表明该入口或选项应可供操作。</w:t>
+        <w:t>添加监控项表单显示 HTTP(s) 类型及名称、URL、检查间隔等配置项。</w:t>
+      </w:r>
+    </w:p>
+    <w:p>
+      <w:pPr>
+        <w:spacing w:after="0"/>
+      </w:pPr>
+      <w:r>
+        <w:rPr>
+          <w:b/>
+        </w:rPr>
+        <w:t xml:space="preserve">实际: </w:t>
+      </w:r>
+      <w:r>
+        <w:t>添加监控项表单显示 HTTP(s) 类型及名称、URL、检查间隔等配置项。</w:t>
+      </w:r>
+    </w:p>
+    <w:p>
+      <w:pPr>
+        <w:keepNext/>
+        <w:jc w:val="center"/>
+      </w:pPr>
+      <w:r>
+        <w:drawing>
+          <wp:inline xmlns:a="http://schemas.openxmlformats.org/drawingml/2006/main" xmlns:pic="http://schemas.openxmlformats.org/drawingml/2006/picture">
+            <wp:extent cx="5715000" cy="3924607"/>
+            <wp:docPr id="1" name="Picture 1" descr="https://demo.kuma.pet/dashboard/1 | ev-kuma-monitor"/>
+            <wp:cNvGraphicFramePr>
+              <a:graphicFrameLocks noChangeAspect="1"/>
+            </wp:cNvGraphicFramePr>
+            <a:graphic>
+              <a:graphicData uri="http://schemas.openxmlformats.org/drawingml/2006/picture">
+                <pic:pic>
+                  <pic:nvPicPr>
+                    <pic:cNvPr id="0" name="ev-kuma-monitor.jpg"/>
+                    <pic:cNvPicPr/>
+                  </pic:nvPicPr>
+                  <pic:blipFill>
+                    <a:blip r:embed="rId10"/>
+                    <a:stretch>
+                      <a:fillRect/>
+                    </a:stretch>
+                  </pic:blipFill>
+                  <pic:spPr>
+                    <a:xfrm>
+                      <a:off x="0" y="0"/>
+                      <a:ext cx="5715000" cy="3924607"/>
+                    </a:xfrm>
+                    <a:prstGeom prst="rect"/>
+                  </pic:spPr>
+                </pic:pic>
+              </a:graphicData>
+            </a:graphic>
+          </wp:inline>
+        </w:drawing>
+      </w:r>
+    </w:p>
+    <w:p>
+      <w:pPr>
+        <w:keepLines/>
+        <w:spacing w:after="200"/>
+        <w:jc w:val="center"/>
+      </w:pPr>
+      <w:r>
+        <w:t>图 1  https://demo.kuma.pet/dashboard/1</w:t>
       </w:r>
     </w:p>
     <w:p>
@@ -280,7 +333,7 @@
         <w:rPr>
           <w:b/>
         </w:rPr>
-        <w:t>填写目标 URL、名称和检查间隔等字段。</w:t>
+        <w:t>填写名称 AutoScribe Demo Website 和 URL https://example.com，保留 60 秒检查间隔。</w:t>
       </w:r>
     </w:p>
     <w:p>
@@ -308,7 +361,71 @@
         <w:t xml:space="preserve">预期: </w:t>
       </w:r>
       <w:r>
-        <w:t>设置应保留在此功能的配置中。</w:t>
+        <w:t>表单使用合成名称与 example.com；保存后的监控详情显示该 URL 和 60 秒检查间隔。</w:t>
+      </w:r>
+    </w:p>
+    <w:p>
+      <w:pPr>
+        <w:spacing w:after="0"/>
+      </w:pPr>
+      <w:r>
+        <w:rPr>
+          <w:b/>
+        </w:rPr>
+        <w:t xml:space="preserve">实际: </w:t>
+      </w:r>
+      <w:r>
+        <w:t>表单使用合成名称与 example.com；保存后的监控详情显示该 URL 和 60 秒检查间隔。</w:t>
+      </w:r>
+    </w:p>
+    <w:p>
+      <w:pPr>
+        <w:keepNext/>
+        <w:jc w:val="center"/>
+      </w:pPr>
+      <w:r>
+        <w:drawing>
+          <wp:inline xmlns:a="http://schemas.openxmlformats.org/drawingml/2006/main" xmlns:pic="http://schemas.openxmlformats.org/drawingml/2006/picture">
+            <wp:extent cx="5715000" cy="3924607"/>
+            <wp:docPr id="2" name="Picture 2" descr="https://demo.kuma.pet/dashboard/1 | ev-kuma-monitor"/>
+            <wp:cNvGraphicFramePr>
+              <a:graphicFrameLocks noChangeAspect="1"/>
+            </wp:cNvGraphicFramePr>
+            <a:graphic>
+              <a:graphicData uri="http://schemas.openxmlformats.org/drawingml/2006/picture">
+                <pic:pic>
+                  <pic:nvPicPr>
+                    <pic:cNvPr id="0" name="ev-kuma-monitor.jpg"/>
+                    <pic:cNvPicPr/>
+                  </pic:nvPicPr>
+                  <pic:blipFill>
+                    <a:blip r:embed="rId10"/>
+                    <a:stretch>
+                      <a:fillRect/>
+                    </a:stretch>
+                  </pic:blipFill>
+                  <pic:spPr>
+                    <a:xfrm>
+                      <a:off x="0" y="0"/>
+                      <a:ext cx="5715000" cy="3924607"/>
+                    </a:xfrm>
+                    <a:prstGeom prst="rect"/>
+                  </pic:spPr>
+                </pic:pic>
+              </a:graphicData>
+            </a:graphic>
+          </wp:inline>
+        </w:drawing>
+      </w:r>
+    </w:p>
+    <w:p>
+      <w:pPr>
+        <w:keepLines/>
+        <w:spacing w:after="200"/>
+        <w:jc w:val="center"/>
+      </w:pPr>
+      <w:r>
+        <w:t>图 2  https://demo.kuma.pet/dashboard/1</w:t>
       </w:r>
     </w:p>
     <w:p>
@@ -322,7 +439,7 @@
         <w:rPr>
           <w:b/>
         </w:rPr>
-        <w:t>保存监控项，并在列表中检查其名称和状态入口。</w:t>
+        <w:t>保存监控，并在仪表盘和心跳历史中核对状态。</w:t>
       </w:r>
     </w:p>
     <w:p>
@@ -350,7 +467,71 @@
         <w:t xml:space="preserve">预期: </w:t>
       </w:r>
       <w:r>
-        <w:t>按源码描述，保存后的目标项应出现在相应列表或输出区域；该结果尚未实测。</w:t>
+        <w:t>仪表盘出现 AutoScribe Demo Website；首次及后续心跳均为 HTTP 200 - OK，状态正常。</w:t>
+      </w:r>
+    </w:p>
+    <w:p>
+      <w:pPr>
+        <w:spacing w:after="0"/>
+      </w:pPr>
+      <w:r>
+        <w:rPr>
+          <w:b/>
+        </w:rPr>
+        <w:t xml:space="preserve">实际: </w:t>
+      </w:r>
+      <w:r>
+        <w:t>仪表盘出现 AutoScribe Demo Website；首次及后续心跳均为 HTTP 200 - OK，状态正常。</w:t>
+      </w:r>
+    </w:p>
+    <w:p>
+      <w:pPr>
+        <w:keepNext/>
+        <w:jc w:val="center"/>
+      </w:pPr>
+      <w:r>
+        <w:drawing>
+          <wp:inline xmlns:a="http://schemas.openxmlformats.org/drawingml/2006/main" xmlns:pic="http://schemas.openxmlformats.org/drawingml/2006/picture">
+            <wp:extent cx="5715000" cy="3924607"/>
+            <wp:docPr id="3" name="Picture 3" descr="https://demo.kuma.pet/dashboard/1 | ev-kuma-monitor"/>
+            <wp:cNvGraphicFramePr>
+              <a:graphicFrameLocks noChangeAspect="1"/>
+            </wp:cNvGraphicFramePr>
+            <a:graphic>
+              <a:graphicData uri="http://schemas.openxmlformats.org/drawingml/2006/picture">
+                <pic:pic>
+                  <pic:nvPicPr>
+                    <pic:cNvPr id="0" name="ev-kuma-monitor.jpg"/>
+                    <pic:cNvPicPr/>
+                  </pic:nvPicPr>
+                  <pic:blipFill>
+                    <a:blip r:embed="rId10"/>
+                    <a:stretch>
+                      <a:fillRect/>
+                    </a:stretch>
+                  </pic:blipFill>
+                  <pic:spPr>
+                    <a:xfrm>
+                      <a:off x="0" y="0"/>
+                      <a:ext cx="5715000" cy="3924607"/>
+                    </a:xfrm>
+                    <a:prstGeom prst="rect"/>
+                  </pic:spPr>
+                </pic:pic>
+              </a:graphicData>
+            </a:graphic>
+          </wp:inline>
+        </w:drawing>
+      </w:r>
+    </w:p>
+    <w:p>
+      <w:pPr>
+        <w:keepLines/>
+        <w:spacing w:after="200"/>
+        <w:jc w:val="center"/>
+      </w:pPr>
+      <w:r>
+        <w:t>图 3  https://demo.kuma.pet/dashboard/1</w:t>
       </w:r>
     </w:p>
     <w:p>
@@ -406,7 +587,7 @@
     </w:p>
     <w:p>
       <w:r>
-        <w:t>本章介绍配置通知渠道的源码线索与候选操作步骤，供后续在目标实例中逐项验证。</w:t>
+        <w:t>通知渠道设置的实际界面流程与结果，按 Uptime Kuma 官方临时演示实例记录。</w:t>
       </w:r>
     </w:p>
     <w:p>
@@ -478,7 +659,7 @@
         <w:t xml:space="preserve">流程状态: </w:t>
       </w:r>
       <w:r>
-        <w:t>未验证</w:t>
+        <w:t>已验证</w:t>
       </w:r>
     </w:p>
     <w:p>
@@ -520,7 +701,7 @@
         <w:t xml:space="preserve">成功标准: </w:t>
       </w:r>
       <w:r>
-        <w:t>源码包含多个通知提供方配置；成功标准是通知渠道保存并可在监控配置中选择。</w:t>
+        <w:t>通知渠道可保存，并可在监控编辑页选择并关联。该验证不包含实际消息投递。</w:t>
       </w:r>
     </w:p>
     <w:p>
@@ -537,17 +718,6 @@
       </w:pPr>
       <w:r>
         <w:t>已准备通知服务所需的非敏感连接信息。</w:t>
-      </w:r>
-    </w:p>
-    <w:p>
-      <w:r>
-        <w:rPr>
-          <w:b/>
-        </w:rPr>
-        <w:t xml:space="preserve">说明: </w:t>
-      </w:r>
-      <w:r>
-        <w:t>本流程根据固定版本的公开源码整理，尚未在目标应用中实际操作或验证。</w:t>
       </w:r>
     </w:p>
     <w:p>
@@ -561,7 +731,7 @@
         <w:rPr>
           <w:b/>
         </w:rPr>
-        <w:t>进入通知设置并选择一个通知提供方。</w:t>
+        <w:t>在“设置 → 通知”中打开新增通知渠道，选择 Webhook。</w:t>
       </w:r>
     </w:p>
     <w:p>
@@ -589,7 +759,71 @@
         <w:t xml:space="preserve">预期: </w:t>
       </w:r>
       <w:r>
-        <w:t>源码线索表明该入口或选项应可供操作。</w:t>
+        <w:t>通知类型列表包含 Webhook，切换后显示 Post URL、HTTP 方法和请求体字段。</w:t>
+      </w:r>
+    </w:p>
+    <w:p>
+      <w:pPr>
+        <w:spacing w:after="0"/>
+      </w:pPr>
+      <w:r>
+        <w:rPr>
+          <w:b/>
+        </w:rPr>
+        <w:t xml:space="preserve">实际: </w:t>
+      </w:r>
+      <w:r>
+        <w:t>通知类型列表包含 Webhook，切换后显示 Post URL、HTTP 方法和请求体字段。</w:t>
+      </w:r>
+    </w:p>
+    <w:p>
+      <w:pPr>
+        <w:keepNext/>
+        <w:jc w:val="center"/>
+      </w:pPr>
+      <w:r>
+        <w:drawing>
+          <wp:inline xmlns:a="http://schemas.openxmlformats.org/drawingml/2006/main" xmlns:pic="http://schemas.openxmlformats.org/drawingml/2006/picture">
+            <wp:extent cx="5715000" cy="3924607"/>
+            <wp:docPr id="4" name="Picture 4" descr="https://demo.kuma.pet/settings/notifications | ev-kuma-notification"/>
+            <wp:cNvGraphicFramePr>
+              <a:graphicFrameLocks noChangeAspect="1"/>
+            </wp:cNvGraphicFramePr>
+            <a:graphic>
+              <a:graphicData uri="http://schemas.openxmlformats.org/drawingml/2006/picture">
+                <pic:pic>
+                  <pic:nvPicPr>
+                    <pic:cNvPr id="0" name="ev-kuma-notification.jpg"/>
+                    <pic:cNvPicPr/>
+                  </pic:nvPicPr>
+                  <pic:blipFill>
+                    <a:blip r:embed="rId11"/>
+                    <a:stretch>
+                      <a:fillRect/>
+                    </a:stretch>
+                  </pic:blipFill>
+                  <pic:spPr>
+                    <a:xfrm>
+                      <a:off x="0" y="0"/>
+                      <a:ext cx="5715000" cy="3924607"/>
+                    </a:xfrm>
+                    <a:prstGeom prst="rect"/>
+                  </pic:spPr>
+                </pic:pic>
+              </a:graphicData>
+            </a:graphic>
+          </wp:inline>
+        </w:drawing>
+      </w:r>
+    </w:p>
+    <w:p>
+      <w:pPr>
+        <w:keepLines/>
+        <w:spacing w:after="200"/>
+        <w:jc w:val="center"/>
+      </w:pPr>
+      <w:r>
+        <w:t>图 1  https://demo.kuma.pet/settings/notifications</w:t>
       </w:r>
     </w:p>
     <w:p>
@@ -603,7 +837,7 @@
         <w:rPr>
           <w:b/>
         </w:rPr>
-        <w:t>填写该提供方要求的配置字段。</w:t>
+        <w:t>填入 Demo Placeholder Webhook 与 https://example.invalid/uptime-kuma-test，并选择 application/json 请求体。</w:t>
       </w:r>
     </w:p>
     <w:p>
@@ -631,7 +865,71 @@
         <w:t xml:space="preserve">预期: </w:t>
       </w:r>
       <w:r>
-        <w:t>设置应保留在此功能的配置中。</w:t>
+        <w:t>渠道保存成功，通知列表出现 Demo Placeholder Webhook。未点击“测试”，未发送通知。</w:t>
+      </w:r>
+    </w:p>
+    <w:p>
+      <w:pPr>
+        <w:spacing w:after="0"/>
+      </w:pPr>
+      <w:r>
+        <w:rPr>
+          <w:b/>
+        </w:rPr>
+        <w:t xml:space="preserve">实际: </w:t>
+      </w:r>
+      <w:r>
+        <w:t>渠道保存成功，通知列表出现 Demo Placeholder Webhook。未点击“测试”，未发送通知。</w:t>
+      </w:r>
+    </w:p>
+    <w:p>
+      <w:pPr>
+        <w:keepNext/>
+        <w:jc w:val="center"/>
+      </w:pPr>
+      <w:r>
+        <w:drawing>
+          <wp:inline xmlns:a="http://schemas.openxmlformats.org/drawingml/2006/main" xmlns:pic="http://schemas.openxmlformats.org/drawingml/2006/picture">
+            <wp:extent cx="5715000" cy="3924607"/>
+            <wp:docPr id="5" name="Picture 5" descr="https://demo.kuma.pet/settings/notifications | ev-kuma-notification"/>
+            <wp:cNvGraphicFramePr>
+              <a:graphicFrameLocks noChangeAspect="1"/>
+            </wp:cNvGraphicFramePr>
+            <a:graphic>
+              <a:graphicData uri="http://schemas.openxmlformats.org/drawingml/2006/picture">
+                <pic:pic>
+                  <pic:nvPicPr>
+                    <pic:cNvPr id="0" name="ev-kuma-notification.jpg"/>
+                    <pic:cNvPicPr/>
+                  </pic:nvPicPr>
+                  <pic:blipFill>
+                    <a:blip r:embed="rId11"/>
+                    <a:stretch>
+                      <a:fillRect/>
+                    </a:stretch>
+                  </pic:blipFill>
+                  <pic:spPr>
+                    <a:xfrm>
+                      <a:off x="0" y="0"/>
+                      <a:ext cx="5715000" cy="3924607"/>
+                    </a:xfrm>
+                    <a:prstGeom prst="rect"/>
+                  </pic:spPr>
+                </pic:pic>
+              </a:graphicData>
+            </a:graphic>
+          </wp:inline>
+        </w:drawing>
+      </w:r>
+    </w:p>
+    <w:p>
+      <w:pPr>
+        <w:keepLines/>
+        <w:spacing w:after="200"/>
+        <w:jc w:val="center"/>
+      </w:pPr>
+      <w:r>
+        <w:t>图 2  https://demo.kuma.pet/settings/notifications</w:t>
       </w:r>
     </w:p>
     <w:p>
@@ -645,7 +943,7 @@
         <w:rPr>
           <w:b/>
         </w:rPr>
-        <w:t>保存设置，再将通知渠道关联到监控项。</w:t>
+        <w:t>编辑 AutoScribe Demo Website，勾选 Demo Placeholder Webhook 并保存。</w:t>
       </w:r>
     </w:p>
     <w:p>
@@ -673,7 +971,71 @@
         <w:t xml:space="preserve">预期: </w:t>
       </w:r>
       <w:r>
-        <w:t>按源码描述，保存后的目标项应出现在相应列表或输出区域；该结果尚未实测。</w:t>
+        <w:t>监控编辑页中 Demo Placeholder Webhook 复选框已勾选，页面提示已保存。</w:t>
+      </w:r>
+    </w:p>
+    <w:p>
+      <w:pPr>
+        <w:spacing w:after="0"/>
+      </w:pPr>
+      <w:r>
+        <w:rPr>
+          <w:b/>
+        </w:rPr>
+        <w:t xml:space="preserve">实际: </w:t>
+      </w:r>
+      <w:r>
+        <w:t>监控编辑页中 Demo Placeholder Webhook 复选框已勾选，页面提示已保存。</w:t>
+      </w:r>
+    </w:p>
+    <w:p>
+      <w:pPr>
+        <w:keepNext/>
+        <w:jc w:val="center"/>
+      </w:pPr>
+      <w:r>
+        <w:drawing>
+          <wp:inline xmlns:a="http://schemas.openxmlformats.org/drawingml/2006/main" xmlns:pic="http://schemas.openxmlformats.org/drawingml/2006/picture">
+            <wp:extent cx="5715000" cy="3924607"/>
+            <wp:docPr id="6" name="Picture 6" descr="https://demo.kuma.pet/edit/1 | ev-kuma-notification-assignment"/>
+            <wp:cNvGraphicFramePr>
+              <a:graphicFrameLocks noChangeAspect="1"/>
+            </wp:cNvGraphicFramePr>
+            <a:graphic>
+              <a:graphicData uri="http://schemas.openxmlformats.org/drawingml/2006/picture">
+                <pic:pic>
+                  <pic:nvPicPr>
+                    <pic:cNvPr id="0" name="ev-kuma-notification-assignment.jpg"/>
+                    <pic:cNvPicPr/>
+                  </pic:nvPicPr>
+                  <pic:blipFill>
+                    <a:blip r:embed="rId12"/>
+                    <a:stretch>
+                      <a:fillRect/>
+                    </a:stretch>
+                  </pic:blipFill>
+                  <pic:spPr>
+                    <a:xfrm>
+                      <a:off x="0" y="0"/>
+                      <a:ext cx="5715000" cy="3924607"/>
+                    </a:xfrm>
+                    <a:prstGeom prst="rect"/>
+                  </pic:spPr>
+                </pic:pic>
+              </a:graphicData>
+            </a:graphic>
+          </wp:inline>
+        </w:drawing>
+      </w:r>
+    </w:p>
+    <w:p>
+      <w:pPr>
+        <w:keepLines/>
+        <w:spacing w:after="200"/>
+        <w:jc w:val="center"/>
+      </w:pPr>
+      <w:r>
+        <w:t>图 3  https://demo.kuma.pet/edit/1</w:t>
       </w:r>
     </w:p>
     <w:p>
@@ -729,7 +1091,7 @@
     </w:p>
     <w:p>
       <w:r>
-        <w:t>本章介绍创建状态页的源码线索与候选操作步骤，供后续在目标实例中逐项验证。</w:t>
+        <w:t>状态页管理的实际界面流程与结果，按 Uptime Kuma 官方临时演示实例记录。</w:t>
       </w:r>
     </w:p>
     <w:p>
@@ -801,7 +1163,7 @@
         <w:t xml:space="preserve">流程状态: </w:t>
       </w:r>
       <w:r>
-        <w:t>未验证</w:t>
+        <w:t>已验证</w:t>
       </w:r>
     </w:p>
     <w:p>
@@ -843,7 +1205,7 @@
         <w:t xml:space="preserve">成功标准: </w:t>
       </w:r>
       <w:r>
-        <w:t>源码包含新增和管理状态页页面；成功标准是状态页配置可保存，并可组织监控展示分组。</w:t>
+        <w:t>状态页保存成功，公开视图显示已添加的测试监控及其运行状态。</w:t>
       </w:r>
     </w:p>
     <w:p>
@@ -860,17 +1222,6 @@
       </w:pPr>
       <w:r>
         <w:t>已存在可用于展示的监控项。</w:t>
-      </w:r>
-    </w:p>
-    <w:p>
-      <w:r>
-        <w:rPr>
-          <w:b/>
-        </w:rPr>
-        <w:t xml:space="preserve">说明: </w:t>
-      </w:r>
-      <w:r>
-        <w:t>本流程根据固定版本的公开源码整理，尚未在目标应用中实际操作或验证。</w:t>
       </w:r>
     </w:p>
     <w:p>
@@ -884,7 +1235,7 @@
         <w:rPr>
           <w:b/>
         </w:rPr>
-        <w:t>打开新增状态页入口。</w:t>
+        <w:t>从“状态页面”管理页点击“新的状态页”。</w:t>
       </w:r>
     </w:p>
     <w:p>
@@ -912,7 +1263,71 @@
         <w:t xml:space="preserve">预期: </w:t>
       </w:r>
       <w:r>
-        <w:t>源码线索表明该入口或选项应可供操作。</w:t>
+        <w:t>进入“添加新的状态页”页面，要求填写名称和路径。</w:t>
+      </w:r>
+    </w:p>
+    <w:p>
+      <w:pPr>
+        <w:spacing w:after="0"/>
+      </w:pPr>
+      <w:r>
+        <w:rPr>
+          <w:b/>
+        </w:rPr>
+        <w:t xml:space="preserve">实际: </w:t>
+      </w:r>
+      <w:r>
+        <w:t>进入“添加新的状态页”页面，要求填写名称和路径。</w:t>
+      </w:r>
+    </w:p>
+    <w:p>
+      <w:pPr>
+        <w:keepNext/>
+        <w:jc w:val="center"/>
+      </w:pPr>
+      <w:r>
+        <w:drawing>
+          <wp:inline xmlns:a="http://schemas.openxmlformats.org/drawingml/2006/main" xmlns:pic="http://schemas.openxmlformats.org/drawingml/2006/picture">
+            <wp:extent cx="5715000" cy="3924607"/>
+            <wp:docPr id="7" name="Picture 7" descr="https://demo.kuma.pet/status/autoscribe-demo | ev-kuma-status-editor"/>
+            <wp:cNvGraphicFramePr>
+              <a:graphicFrameLocks noChangeAspect="1"/>
+            </wp:cNvGraphicFramePr>
+            <a:graphic>
+              <a:graphicData uri="http://schemas.openxmlformats.org/drawingml/2006/picture">
+                <pic:pic>
+                  <pic:nvPicPr>
+                    <pic:cNvPr id="0" name="ev-kuma-status-editor.jpg"/>
+                    <pic:cNvPicPr/>
+                  </pic:nvPicPr>
+                  <pic:blipFill>
+                    <a:blip r:embed="rId13"/>
+                    <a:stretch>
+                      <a:fillRect/>
+                    </a:stretch>
+                  </pic:blipFill>
+                  <pic:spPr>
+                    <a:xfrm>
+                      <a:off x="0" y="0"/>
+                      <a:ext cx="5715000" cy="3924607"/>
+                    </a:xfrm>
+                    <a:prstGeom prst="rect"/>
+                  </pic:spPr>
+                </pic:pic>
+              </a:graphicData>
+            </a:graphic>
+          </wp:inline>
+        </w:drawing>
+      </w:r>
+    </w:p>
+    <w:p>
+      <w:pPr>
+        <w:keepLines/>
+        <w:spacing w:after="200"/>
+        <w:jc w:val="center"/>
+      </w:pPr>
+      <w:r>
+        <w:t>图 1  https://demo.kuma.pet/status/autoscribe-demo</w:t>
       </w:r>
     </w:p>
     <w:p>
@@ -926,7 +1341,7 @@
         <w:rPr>
           <w:b/>
         </w:rPr>
-        <w:t>填写状态页名称及展示标识。</w:t>
+        <w:t>设置名称 AutoScribe Demo Status 和路径 autoscribe-demo，进入状态页编辑器。</w:t>
       </w:r>
     </w:p>
     <w:p>
@@ -954,7 +1369,71 @@
         <w:t xml:space="preserve">预期: </w:t>
       </w:r>
       <w:r>
-        <w:t>设置应保留在此功能的配置中。</w:t>
+        <w:t>编辑器标题显示 AutoScribe Demo Status，路径显示 /status/autoscribe-demo。</w:t>
+      </w:r>
+    </w:p>
+    <w:p>
+      <w:pPr>
+        <w:spacing w:after="0"/>
+      </w:pPr>
+      <w:r>
+        <w:rPr>
+          <w:b/>
+        </w:rPr>
+        <w:t xml:space="preserve">实际: </w:t>
+      </w:r>
+      <w:r>
+        <w:t>编辑器标题显示 AutoScribe Demo Status，路径显示 /status/autoscribe-demo。</w:t>
+      </w:r>
+    </w:p>
+    <w:p>
+      <w:pPr>
+        <w:keepNext/>
+        <w:jc w:val="center"/>
+      </w:pPr>
+      <w:r>
+        <w:drawing>
+          <wp:inline xmlns:a="http://schemas.openxmlformats.org/drawingml/2006/main" xmlns:pic="http://schemas.openxmlformats.org/drawingml/2006/picture">
+            <wp:extent cx="5715000" cy="3924607"/>
+            <wp:docPr id="8" name="Picture 8" descr="https://demo.kuma.pet/status/autoscribe-demo | ev-kuma-status-editor"/>
+            <wp:cNvGraphicFramePr>
+              <a:graphicFrameLocks noChangeAspect="1"/>
+            </wp:cNvGraphicFramePr>
+            <a:graphic>
+              <a:graphicData uri="http://schemas.openxmlformats.org/drawingml/2006/picture">
+                <pic:pic>
+                  <pic:nvPicPr>
+                    <pic:cNvPr id="0" name="ev-kuma-status-editor.jpg"/>
+                    <pic:cNvPicPr/>
+                  </pic:nvPicPr>
+                  <pic:blipFill>
+                    <a:blip r:embed="rId13"/>
+                    <a:stretch>
+                      <a:fillRect/>
+                    </a:stretch>
+                  </pic:blipFill>
+                  <pic:spPr>
+                    <a:xfrm>
+                      <a:off x="0" y="0"/>
+                      <a:ext cx="5715000" cy="3924607"/>
+                    </a:xfrm>
+                    <a:prstGeom prst="rect"/>
+                  </pic:spPr>
+                </pic:pic>
+              </a:graphicData>
+            </a:graphic>
+          </wp:inline>
+        </w:drawing>
+      </w:r>
+    </w:p>
+    <w:p>
+      <w:pPr>
+        <w:keepLines/>
+        <w:spacing w:after="200"/>
+        <w:jc w:val="center"/>
+      </w:pPr>
+      <w:r>
+        <w:t>图 2  https://demo.kuma.pet/status/autoscribe-demo</w:t>
       </w:r>
     </w:p>
     <w:p>
@@ -968,7 +1447,7 @@
         <w:rPr>
           <w:b/>
         </w:rPr>
-        <w:t>保存后进入状态页管理，添加需要展示的监控项。</w:t>
+        <w:t>将 AutoScribe Demo Website 加入状态页并保存，打开公开视图确认。</w:t>
       </w:r>
     </w:p>
     <w:p>
@@ -996,7 +1475,121 @@
         <w:t xml:space="preserve">预期: </w:t>
       </w:r>
       <w:r>
-        <w:t>按源码描述，保存后的目标项应出现在相应列表或输出区域；该结果尚未实测。</w:t>
+        <w:t>公开状态页显示“所有服务运行正常”、服务分组、AutoScribe Demo Website 和 100% 在线状态。</w:t>
+      </w:r>
+    </w:p>
+    <w:p>
+      <w:pPr>
+        <w:spacing w:after="0"/>
+      </w:pPr>
+      <w:r>
+        <w:rPr>
+          <w:b/>
+        </w:rPr>
+        <w:t xml:space="preserve">实际: </w:t>
+      </w:r>
+      <w:r>
+        <w:t>公开状态页显示“所有服务运行正常”、服务分组、AutoScribe Demo Website 和 100% 在线状态。</w:t>
+      </w:r>
+    </w:p>
+    <w:p>
+      <w:pPr>
+        <w:keepNext/>
+        <w:jc w:val="center"/>
+      </w:pPr>
+      <w:r>
+        <w:drawing>
+          <wp:inline xmlns:a="http://schemas.openxmlformats.org/drawingml/2006/main" xmlns:pic="http://schemas.openxmlformats.org/drawingml/2006/picture">
+            <wp:extent cx="5715000" cy="3924607"/>
+            <wp:docPr id="9" name="Picture 9" descr="https://demo.kuma.pet/status/autoscribe-demo | ev-kuma-status-picker"/>
+            <wp:cNvGraphicFramePr>
+              <a:graphicFrameLocks noChangeAspect="1"/>
+            </wp:cNvGraphicFramePr>
+            <a:graphic>
+              <a:graphicData uri="http://schemas.openxmlformats.org/drawingml/2006/picture">
+                <pic:pic>
+                  <pic:nvPicPr>
+                    <pic:cNvPr id="0" name="ev-kuma-status-picker.jpg"/>
+                    <pic:cNvPicPr/>
+                  </pic:nvPicPr>
+                  <pic:blipFill>
+                    <a:blip r:embed="rId14"/>
+                    <a:stretch>
+                      <a:fillRect/>
+                    </a:stretch>
+                  </pic:blipFill>
+                  <pic:spPr>
+                    <a:xfrm>
+                      <a:off x="0" y="0"/>
+                      <a:ext cx="5715000" cy="3924607"/>
+                    </a:xfrm>
+                    <a:prstGeom prst="rect"/>
+                  </pic:spPr>
+                </pic:pic>
+              </a:graphicData>
+            </a:graphic>
+          </wp:inline>
+        </w:drawing>
+      </w:r>
+    </w:p>
+    <w:p>
+      <w:pPr>
+        <w:keepLines/>
+        <w:spacing w:after="200"/>
+        <w:jc w:val="center"/>
+      </w:pPr>
+      <w:r>
+        <w:t>图 3  https://demo.kuma.pet/status/autoscribe-demo</w:t>
+      </w:r>
+    </w:p>
+    <w:p>
+      <w:pPr>
+        <w:keepNext/>
+        <w:jc w:val="center"/>
+      </w:pPr>
+      <w:r>
+        <w:drawing>
+          <wp:inline xmlns:a="http://schemas.openxmlformats.org/drawingml/2006/main" xmlns:pic="http://schemas.openxmlformats.org/drawingml/2006/picture">
+            <wp:extent cx="5715000" cy="3924607"/>
+            <wp:docPr id="10" name="Picture 10" descr="https://demo.kuma.pet/status/autoscribe-demo | ev-kuma-status-public"/>
+            <wp:cNvGraphicFramePr>
+              <a:graphicFrameLocks noChangeAspect="1"/>
+            </wp:cNvGraphicFramePr>
+            <a:graphic>
+              <a:graphicData uri="http://schemas.openxmlformats.org/drawingml/2006/picture">
+                <pic:pic>
+                  <pic:nvPicPr>
+                    <pic:cNvPr id="0" name="ev-kuma-status-public.jpg"/>
+                    <pic:cNvPicPr/>
+                  </pic:nvPicPr>
+                  <pic:blipFill>
+                    <a:blip r:embed="rId15"/>
+                    <a:stretch>
+                      <a:fillRect/>
+                    </a:stretch>
+                  </pic:blipFill>
+                  <pic:spPr>
+                    <a:xfrm>
+                      <a:off x="0" y="0"/>
+                      <a:ext cx="5715000" cy="3924607"/>
+                    </a:xfrm>
+                    <a:prstGeom prst="rect"/>
+                  </pic:spPr>
+                </pic:pic>
+              </a:graphicData>
+            </a:graphic>
+          </wp:inline>
+        </w:drawing>
+      </w:r>
+    </w:p>
+    <w:p>
+      <w:pPr>
+        <w:keepLines/>
+        <w:spacing w:after="200"/>
+        <w:jc w:val="center"/>
+      </w:pPr>
+      <w:r>
+        <w:t>图 3  https://demo.kuma.pet/status/autoscribe-demo</w:t>
       </w:r>
     </w:p>
     <w:p>
@@ -1050,7 +1643,31 @@
         <w:pStyle w:val="ListBullet"/>
       </w:pPr>
       <w:r>
-        <w:t>这份手册固定到指定公开源码提交；三个监控功能流程均未在运行中的应用界面执行。仓库另附首次启动页面截图，但它不作为监控、通知或状态页流程的验证证据。菜单位置、字段和功能结果仍需在目标实例中确认。</w:t>
+        <w:t>运行验证于 Uptime Kuma 官方临时演示实例 demo.kuma.pet，演示实例会自动过期；截图记录的是 2026-09-29 的会话。</w:t>
+      </w:r>
+    </w:p>
+    <w:p>
+      <w:pPr>
+        <w:pStyle w:val="ListBullet"/>
+      </w:pPr>
+      <w:r>
+        <w:t>手册源码引用固定到公开提交 e7420f8fa546a8baa7ac4bf9d10a32545d4346e0；演示站运行版本未单独核实，源码版本与演示实例版本可能不同。</w:t>
+      </w:r>
+    </w:p>
+    <w:p>
+      <w:pPr>
+        <w:pStyle w:val="ListBullet"/>
+      </w:pPr>
+      <w:r>
+        <w:t>通知流程只验证了 Webhook 配置保存及与监控项关联。接收地址使用 example.invalid 保留域，未点击“测试”，因此没有验证真实通知投递。</w:t>
+      </w:r>
+    </w:p>
+    <w:p>
+      <w:pPr>
+        <w:pStyle w:val="ListBullet"/>
+      </w:pPr>
+      <w:r>
+        <w:t>截图不包含密码或通知密钥。</w:t>
       </w:r>
     </w:p>
     <w:sectPr>

</xml_diff>